<commit_message>
docs: add demo video link to one-pager and evidence doc
Embed the demo video (youtube.com/shorts/wCH-2Z9WxEw) in the one-pager
showcase header and replace the placeholder in the supporting-evidence
Word document with the live link.

Co-Authored-By: Claude Opus 4.8 <noreply@anthropic.com>
Claude-Session: https://claude.ai/code/session_01XuNSKfFGFgyRA5WffAv1uC
</commit_message>
<xml_diff>
--- a/scratch/Forgeron_Supporting_Evidence.docx
+++ b/scratch/Forgeron_Supporting_Evidence.docx
@@ -178,7 +178,7 @@
         </w:rPr>
         <w:t xml:space="preserve">GitHub repository: </w:t>
       </w:r>
-      <w:hyperlink w:history="1" r:id="rIddgz3agcwolt3gzu0avo1k">
+      <w:hyperlink w:history="1" r:id="rIdong36rzbpe8a2iucwxar6">
         <w:r>
           <w:rPr>
             <w:rStyle w:val="Hyperlink"/>
@@ -237,16 +237,16 @@
         </w:rPr>
         <w:t xml:space="preserve">Video link: </w:t>
       </w:r>
-      <w:r>
-        <w:rPr>
-          <w:i/>
-          <w:iCs/>
-          <w:color w:val="6B7686"/>
-          <w:sz w:val="19"/>
-          <w:szCs w:val="19"/>
-        </w:rPr>
-        <w:t xml:space="preserve">[ À COLLER — paste your demo video URL here before submitting ]</w:t>
-      </w:r>
+      <w:hyperlink w:history="1" r:id="rId87cgxsgte9gqdccsirr9u">
+        <w:r>
+          <w:rPr>
+            <w:rStyle w:val="Hyperlink"/>
+            <w:sz w:val="21"/>
+            <w:szCs w:val="21"/>
+          </w:rPr>
+          <w:t xml:space="preserve">https://youtube.com/shorts/wCH-2Z9WxEw</w:t>
+        </w:r>
+      </w:hyperlink>
     </w:p>
     <w:p>
       <w:pPr>

</xml_diff>

<commit_message>
docs: finalize one-pager and evidence doc (machine photo attached separately)
Remove placeholder wording from the hardware card and evidence doc; the
real machine photo is attached directly to the application as a separate
image file.

Co-Authored-By: Claude Opus 4.8 <noreply@anthropic.com>
Claude-Session: https://claude.ai/code/session_01XuNSKfFGFgyRA5WffAv1uC
</commit_message>
<xml_diff>
--- a/scratch/Forgeron_Supporting_Evidence.docx
+++ b/scratch/Forgeron_Supporting_Evidence.docx
@@ -178,7 +178,7 @@
         </w:rPr>
         <w:t xml:space="preserve">GitHub repository: </w:t>
       </w:r>
-      <w:hyperlink w:history="1" r:id="rIdong36rzbpe8a2iucwxar6">
+      <w:hyperlink w:history="1" r:id="rIdsggdxsrdwzg4ctlxgmmv3">
         <w:r>
           <w:rPr>
             <w:rStyle w:val="Hyperlink"/>
@@ -237,7 +237,7 @@
         </w:rPr>
         <w:t xml:space="preserve">Video link: </w:t>
       </w:r>
-      <w:hyperlink w:history="1" r:id="rId87cgxsgte9gqdccsirr9u">
+      <w:hyperlink w:history="1" r:id="rIdulkccslocnckhgt6p1s9i">
         <w:r>
           <w:rPr>
             <w:rStyle w:val="Hyperlink"/>
@@ -288,13 +288,11 @@
       </w:pPr>
       <w:r>
         <w:rPr>
-          <w:i/>
-          <w:iCs/>
-          <w:color w:val="6B7686"/>
-          <w:sz w:val="19"/>
-          <w:szCs w:val="19"/>
-        </w:rPr>
-        <w:t xml:space="preserve">[ Photos of the real machine attached as separate image files ]</w:t>
+          <w:color w:val="1F2733"/>
+          <w:sz w:val="21"/>
+          <w:szCs w:val="21"/>
+        </w:rPr>
+        <w:t xml:space="preserve">A photo of the real, fully assembled machine is attached with this application as a separate image file.</w:t>
       </w:r>
     </w:p>
     <w:p>

</xml_diff>